<commit_message>
Review quyển 6 theo canon quyển 1–5; xuất lại Quyen-6-Vay-cuoi.docx
- Cây phượng thứ ba: đứng nhìn cô lên dốc, ở đầu phố Lưới Biển
- Chuyến lên Sương Lĩnh năm 17 tuổi, ngồi cabin; mẹ biết chuyện lưng trên xe
- Tuổi và số năm giải nghệ của Lăng; phòng tập tầng một nhà họ Tạ
- Chi tiết Aldmere, danh sách triệu tập, luật nhà nguyên văn, giường đơn
- Cập nhật mục canon trong ghi chú

Co-Authored-By: Claude Opus 5.5 <noreply@anthropic.com>
Claude-Session: https://claude.ai/code/session_01Dzjov9DvupqkiCaPa75wHH
</commit_message>
<xml_diff>
--- a/Quyen-6-Vay-cuoi.docx
+++ b/Quyen-6-Vay-cuoi.docx
@@ -870,7 +870,7 @@
         <w:jc w:val="both"/>
       </w:pPr>
       <w:r>
-        <w:t xml:space="preserve">Anh ngồi đối diện cô. Không nói gì. Nhưng cô thấy anh nhìn ra ngoài cửa sổ. Về phía phố Lưới Biển. Cây phượng thứ ba. Bốn năm, từ lớp bảy, anh đứng dưới cây phượng ấy mỗi tối. Chờ cô.</w:t>
+        <w:t xml:space="preserve">Anh ngồi đối diện cô. Không nói gì. Nhưng cô thấy anh nhìn ra ngoài cửa sổ. Về phía phố Lưới Biển. Cây phượng thứ ba. Bốn năm, từ lớp bảy, anh đứng dưới cây phượng ấy mỗi tối. Nhìn cô đi khuất lên dốc rồi mới về.</w:t>
       </w:r>
     </w:p>
     <w:p>
@@ -1970,7 +1970,7 @@
         <w:jc w:val="both"/>
       </w:pPr>
       <w:r>
-        <w:t xml:space="preserve">"Tay." Anh nói. "Anh đặt tay vào đây. Đợi em tập xong ở Hải Âu. Đi về."</w:t>
+        <w:t xml:space="preserve">"Tay." Anh nói. "Anh đặt tay vào đây. Đợi em đi khuất lên dốc. Rồi mới về."</w:t>
       </w:r>
     </w:p>
     <w:p>
@@ -2010,27 +2010,37 @@
         <w:jc w:val="both"/>
       </w:pPr>
       <w:r>
-        <w:t xml:space="preserve">"Không phải đợi em tập xong." Cô nói. "Đợi em ra."</w:t>
-      </w:r>
-    </w:p>
-    <w:p>
-      <w:pPr>
-        <w:spacing w:after="120" w:line="340"/>
-        <w:ind w:firstLine="425"/>
-        <w:jc w:val="both"/>
-      </w:pPr>
-      <w:r>
-        <w:t xml:space="preserve">Hai người đi tiếp. Cuối phố Lưới Biển. Nhà văn hóa phường. Tòa ba tầng. Tường vàng đã bạc. Mái tôn mới trên tầng ba, chỗ Hải Âu.</w:t>
-      </w:r>
-    </w:p>
-    <w:p>
-      <w:pPr>
-        <w:spacing w:after="120" w:line="340"/>
-        <w:ind w:firstLine="425"/>
-        <w:jc w:val="both"/>
-      </w:pPr>
-      <w:r>
-        <w:t xml:space="preserve">Sân xi măng phía trước. Rộng. Ba cây phượng. Một cột cờ. Mấy chiếc ghế đá.</w:t>
+        <w:t xml:space="preserve">"Không phải nhìn em đi." Cô nói. "Đợi em đến."</w:t>
+      </w:r>
+    </w:p>
+    <w:p>
+      <w:pPr>
+        <w:spacing w:after="120" w:line="340"/>
+        <w:ind w:firstLine="425"/>
+        <w:jc w:val="both"/>
+      </w:pPr>
+      <w:r>
+        <w:t xml:space="preserve">Hai người đi tiếp. Phố Lưới Biển ngắn. Cây phượng thứ ba đứng ở đầu phố, ngay chỗ rẽ lên dốc. Từ đấy đến cuối phố là sân xi măng nhà văn hóa phường. Không có tường rào phía phố. Ba cây phượng đầu phố đứng dọc mép sân.</w:t>
+      </w:r>
+    </w:p>
+    <w:p>
+      <w:pPr>
+        <w:spacing w:after="120" w:line="340"/>
+        <w:ind w:firstLine="425"/>
+        <w:jc w:val="both"/>
+      </w:pPr>
+      <w:r>
+        <w:t xml:space="preserve">Cuối sân, nhà văn hóa phường. Tòa ba tầng. Tường vàng đã bạc. Mái tôn mới trên tầng ba, chỗ Hải Âu.</w:t>
+      </w:r>
+    </w:p>
+    <w:p>
+      <w:pPr>
+        <w:spacing w:after="120" w:line="340"/>
+        <w:ind w:firstLine="425"/>
+        <w:jc w:val="both"/>
+      </w:pPr>
+      <w:r>
+        <w:t xml:space="preserve">Sân xi măng rộng. Một cột cờ. Mấy chiếc ghế đá.</w:t>
       </w:r>
     </w:p>
     <w:p>
@@ -2140,7 +2150,7 @@
         <w:jc w:val="both"/>
       </w:pPr>
       <w:r>
-        <w:t xml:space="preserve">"Bác sĩ bảo đầu gối." Cô Tuệ nói. "Bảy mươi sáu tuổi. Bốn mươi năm đứng giữa phòng tập. Đầu gối bảo đủ rồi."</w:t>
+        <w:t xml:space="preserve">"Bác sĩ bảo đầu gối." Cô Tuệ nói. "Bảy mươi sáu tuổi. Năm mươi năm đứng giữa phòng tập. Đầu gối bảo đủ rồi."</w:t>
       </w:r>
     </w:p>
     <w:p>
@@ -11049,6 +11059,26 @@
         <w:jc w:val="both"/>
       </w:pPr>
       <w:r>
+        <w:t xml:space="preserve">"Trên sàn em không giật mình bao giờ."</w:t>
+      </w:r>
+    </w:p>
+    <w:p>
+      <w:pPr>
+        <w:spacing w:after="120" w:line="340"/>
+        <w:ind w:firstLine="425"/>
+        <w:jc w:val="both"/>
+      </w:pPr>
+      <w:r>
+        <w:t xml:space="preserve">"Ừ." Anh nói. "Trên sàn thì không. Xuống sàn thì em miết ngón tay."</w:t>
+      </w:r>
+    </w:p>
+    <w:p>
+      <w:pPr>
+        <w:spacing w:after="120" w:line="340"/>
+        <w:ind w:firstLine="425"/>
+        <w:jc w:val="both"/>
+      </w:pPr>
+      <w:r>
         <w:t xml:space="preserve">Cô cúi xuống nhìn tay mình. Ngón cái tay phải đang miết vào đốt ngón trỏ.</w:t>
       </w:r>
     </w:p>
@@ -13072,7 +13102,7 @@
         <w:jc w:val="both"/>
       </w:pPr>
       <w:r>
-        <w:t xml:space="preserve">Một phút bốn mươi giây cho năm mươi hai mét. Cô chưa bao giờ đếm. Cô chỉ biết cô đi chậm hơn người khác. Từ năm mười tám tuổi. Từ Sương Lĩnh. Từ con dốc thứ ba.</w:t>
+        <w:t xml:space="preserve">Một phút bốn mươi giây cho năm mươi hai mét. Cô chưa bao giờ đếm. Cô chỉ biết cô đi chậm hơn người khác. Từ năm mười bảy tuổi. Từ Sương Lĩnh. Từ con dốc thứ ba.</w:t>
       </w:r>
     </w:p>
     <w:p>
@@ -14792,7 +14822,7 @@
         <w:jc w:val="both"/>
       </w:pPr>
       <w:r>
-        <w:t xml:space="preserve">Ba cây phượng. Đánh số một, hai, ba. Cây thứ ba gần cổng phía phố Lưới Biển. Ô vuông bốn mét nhân bốn mét giữa cây thứ hai và cây thứ ba, gạch chéo bút chì: </w:t>
+        <w:t xml:space="preserve">Ba cây phượng. Đánh số một, hai, ba. Cây thứ ba ở góc sân, đầu phố, chỗ rẽ lên dốc. Ô vuông bốn mét nhân bốn mét giữa cây thứ hai và cây thứ ba, gạch chéo bút chì: </w:t>
       </w:r>
       <w:r>
         <w:rPr>
@@ -15060,7 +15090,7 @@
         <w:jc w:val="both"/>
       </w:pPr>
       <w:r>
-        <w:t xml:space="preserve">Bốn năm. Lớp bảy đến lớp mười. Mỗi tối anh đứng dưới cây phượng thứ ba chờ cô từ Hải Âu đi xuống. Tay đặt lên thân cây. Một chỗ. Vỏ cây mòn.</w:t>
+        <w:t xml:space="preserve">Bốn năm. Lớp bảy đến lớp mười. Mỗi tối anh đứng dưới cây phượng thứ ba nhìn cô đi khuất lên dốc rồi mới về. Tay đặt lên thân cây. Một chỗ. Vỏ cây mòn.</w:t>
       </w:r>
     </w:p>
     <w:p>
@@ -15683,7 +15713,7 @@
         <w:jc w:val="both"/>
       </w:pPr>
       <w:r>
-        <w:t xml:space="preserve">Lăng đặt tay trái lên vai anh. Tay phải vào tay anh. Khung tay Standard. Hai mươi ba năm giải nghệ. Khung tay không đổi.</w:t>
+        <w:t xml:space="preserve">Lăng đặt tay trái lên vai anh. Tay phải vào tay anh. Khung tay Standard. Hai mươi sáu năm giải nghệ. Khung tay không đổi.</w:t>
       </w:r>
     </w:p>
     <w:p>
@@ -15753,7 +15783,7 @@
         <w:jc w:val="both"/>
       </w:pPr>
       <w:r>
-        <w:t xml:space="preserve">Năm anh sáu tuổi, mẹ dẫn anh. Phòng tập Liên đoàn. Gương có vết ố hình con cá. Mẹ bảo: </w:t>
+        <w:t xml:space="preserve">Năm anh sáu tuổi, mẹ dẫn anh. Phòng tập tầng một nhà mình. Mỗi tối mẹ tập Waltz một mình trước gương. Có tối anh tự bước vào. Mẹ bảo: </w:t>
       </w:r>
       <w:r>
         <w:rPr>
@@ -15793,7 +15823,7 @@
         <w:jc w:val="both"/>
       </w:pPr>
       <w:r>
-        <w:t xml:space="preserve">Ô nhịp thứ năm. Lăng nghiêng đầu. Đúng góc. Hai mươi ba năm không đổi.</w:t>
+        <w:t xml:space="preserve">Ô nhịp thứ năm. Lăng nghiêng đầu. Đúng góc. Hai mươi sáu năm không đổi.</w:t>
       </w:r>
     </w:p>
     <w:p>
@@ -16382,7 +16412,7 @@
         <w:jc w:val="both"/>
       </w:pPr>
       <w:r>
-        <w:t xml:space="preserve">"Váy của mày." Mẹ nói. "Năm mày sáu tuổi. Váy xanh lá. Bộ đầu tiên."</w:t>
+        <w:t xml:space="preserve">"Váy của mày." Mẹ nói. "Năm mày sáu tuổi. Váy tập đầu tiên. Xanh ngọc. Như cái váy mày đứng ngắm ở sạp hồi ấy."</w:t>
       </w:r>
     </w:p>
     <w:p>
@@ -16412,7 +16442,7 @@
         <w:jc w:val="both"/>
       </w:pPr>
       <w:r>
-        <w:t xml:space="preserve">"Sửa." Mẹ nói. "Của một đứa lớn hơn mày. Nó bỏ học. Tao cắt ngắn. Mày mặc thi lần đầu. Mày giẫm chân thằng bé ba lần."</w:t>
+        <w:t xml:space="preserve">"Sửa." Mẹ nói. "Của một đứa lớn hơn mày. Nó bỏ học. Tao cắt ngắn. Mày mặc từ buổi tập thứ hai. Buổi đầu mày mặc áo phông cũ. Giẫm chân thằng bé ba lần."</w:t>
       </w:r>
     </w:p>
     <w:p>
@@ -16661,7 +16691,7 @@
         <w:jc w:val="both"/>
       </w:pPr>
       <w:r>
-        <w:t xml:space="preserve">Tám năm. Mẹ bán nhẫn cưới ở sạp vàng thứ hai chợ Vọng Hải. Trả tiền mổ lưng cho cô. Chiếc nhẫn mỏng nhất. Bố mua hai mươi sáu năm trước. Mặc cả bớt ba mươi nghìn.</w:t>
+        <w:t xml:space="preserve">Chín năm. Mẹ bán nhẫn cưới ở sạp vàng thứ hai chợ Vọng Hải. Trả tiền mổ lưng cho cô. Chiếc nhẫn mỏng nhất. Bố mua hai mươi sáu năm trước. Mặc cả bớt ba mươi nghìn.</w:t>
       </w:r>
     </w:p>
     <w:p>
@@ -21900,17 +21930,17 @@
         <w:jc w:val="both"/>
       </w:pPr>
       <w:r>
-        <w:t xml:space="preserve">Năm mười tám tuổi, cô ngồi xe khách lên con đèo này lần đầu. Lưng đeo nẹp. Không ngồi thẳng được. Mẹ ngồi bên cạnh, đặt tay sau lưng cô suốt ba mươi tám khúc cua. Bố lái xe tải đi trước, chở đồ đạc. Cả nhà ở Nguyệt Loan nhét vào một thùng xe.</w:t>
-      </w:r>
-    </w:p>
-    <w:p>
-      <w:pPr>
-        <w:spacing w:after="120" w:line="340"/>
-        <w:ind w:firstLine="425"/>
-        <w:jc w:val="both"/>
-      </w:pPr>
-      <w:r>
-        <w:t xml:space="preserve">Tám năm.</w:t>
+        <w:t xml:space="preserve">Năm mười bảy tuổi, một tuần sau Thạch Kiều, cô lên con đèo này lần đầu. Trong cabin xe tải của bố. Ngồi sát cửa sổ. Lưng đeo nẹp. Không ngồi thẳng được. Em Thu ngủ. Mẹ ngồi bên cạnh, đặt tay sau lưng cô suốt ba mươi tám khúc cua. Cả nhà ở Nguyệt Loan nhét vào một thùng xe.</w:t>
+      </w:r>
+    </w:p>
+    <w:p>
+      <w:pPr>
+        <w:spacing w:after="120" w:line="340"/>
+        <w:ind w:firstLine="425"/>
+        <w:jc w:val="both"/>
+      </w:pPr>
+      <w:r>
+        <w:t xml:space="preserve">Chín năm.</w:t>
       </w:r>
     </w:p>
     <w:p>
@@ -23727,7 +23757,7 @@
         <w:jc w:val="both"/>
       </w:pPr>
       <w:r>
-        <w:t xml:space="preserve">Mẹ không khoác tay. Mẹ chỉ đứng sát vai cô. Như mười tám tuổi. Như ba mươi tám khúc cua.</w:t>
+        <w:t xml:space="preserve">Mẹ không khoác tay. Mẹ chỉ đứng sát vai cô. Như năm mười bảy tuổi. Như ba mươi tám khúc cua.</w:t>
       </w:r>
     </w:p>
     <w:p>
@@ -24158,7 +24188,7 @@
         <w:jc w:val="both"/>
       </w:pPr>
       <w:r>
-        <w:t xml:space="preserve">"Mười tám tuổi." Mẹ nói. Không nhìn cô. "Bố mày lái xe tải chở cả nhà lên con đèo này. Mày nằm sau thùng xe. Đeo nẹp. Bố mày dừng xe ở khúc cua thứ mười chín. Xuống xe. Đứng ở mép vực. Quay lưng như thế. Tao không hỏi."</w:t>
+        <w:t xml:space="preserve">"Năm mày mười bảy tuổi." Mẹ nói. Không nhìn cô. "Bố mày lái xe tải chở cả nhà lên con đèo này. Mày ngồi trong cabin. Đeo nẹp. Mày vừa kể hết chuyện cái lưng cho tao. Bố mày dừng xe ở khúc cua thứ mười chín. Xuống xe. Đứng ở mép vực. Quay lưng như thế. Tao không hỏi."</w:t>
       </w:r>
     </w:p>
     <w:p>
@@ -26616,7 +26646,7 @@
         <w:jc w:val="both"/>
       </w:pPr>
       <w:r>
-        <w:t xml:space="preserve">Từ năm mười hai tuổi, anh đứng ở cây phượng thứ ba chờ cô từ Hải Âu đi xuống. Bốn năm.</w:t>
+        <w:t xml:space="preserve">Từ năm mười hai tuổi, anh đứng ở cây phượng thứ ba nhìn cô đi khuất lên dốc. Bốn năm. Cô không quay lại lần nào.</w:t>
       </w:r>
     </w:p>
     <w:p>
@@ -26786,7 +26816,7 @@
         <w:jc w:val="both"/>
       </w:pPr>
       <w:r>
-        <w:t xml:space="preserve">"Mẹ không biết." Lăng nói. "Hai mươi bảy năm mẹ không hỏi."</w:t>
+        <w:t xml:space="preserve">"Mẹ không biết." Lăng nói. "Ba mươi năm mẹ không hỏi."</w:t>
       </w:r>
     </w:p>
     <w:p>
@@ -28010,7 +28040,7 @@
         <w:jc w:val="both"/>
       </w:pPr>
       <w:r>
-        <w:t xml:space="preserve">"Tao biết." Mẹ nói. "Tao biết mày sẽ nói câu ấy với thằng bé. Tao biết vì sao. Lưng mày. Nợ của bố mày. Thư mời của nó. Tao biết hết."</w:t>
+        <w:t xml:space="preserve">"Tao biết." Mẹ nói. "Tao biết mày sẽ nói câu ấy với thằng bé. Tao không biết vì sao. Nợ của bố mày thì tao biết. Lưng mày thì tao không biết. Mày giấu giỏi. Tao tưởng hai đứa cãi nhau."</w:t>
       </w:r>
     </w:p>
     <w:p>
@@ -28257,7 +28287,17 @@
         <w:jc w:val="both"/>
       </w:pPr>
       <w:r>
-        <w:t xml:space="preserve">"Tao khóc không phải vì bà ấy." Mẹ nói. "Vì bà ấy nói đúng một nửa. Nửa kia tao biết từ đêm trước. Tao nằm bên kia vách nghe mày tập ba mươi lần. Tao không vào."</w:t>
+        <w:t xml:space="preserve">"Tao khóc không phải vì bà ấy." Mẹ nói. "Bà ấy kể chuyện thư mời. Tao mới hiểu câu mày tập ba mươi lần là để làm gì. Bà ấy nói đúng một nửa. Nửa kia tao biết từ đêm trước. Tao nằm bên kia vách nghe mày tập. Tao không vào."</w:t>
+      </w:r>
+    </w:p>
+    <w:p>
+      <w:pPr>
+        <w:spacing w:after="120" w:line="340"/>
+        <w:ind w:firstLine="425"/>
+        <w:jc w:val="both"/>
+      </w:pPr>
+      <w:r>
+        <w:t xml:space="preserve">"Một tuần sau." Mẹ nói. "Trên xe tải lên Sương Lĩnh. Mày kể chuyện cái lưng. Tao nghe hết. Tao không nói với mày là tao đã nghe câu ấy qua vách. Chín năm tao không nói."</w:t>
       </w:r>
     </w:p>
     <w:p>
@@ -28820,7 +28860,7 @@
         <w:jc w:val="both"/>
       </w:pPr>
       <w:r>
-        <w:t xml:space="preserve">Như ở cổng nhà thiếu nhi Sương Lĩnh. Như ở khúc cua thứ mười chín năm cô mười tám tuổi.</w:t>
+        <w:t xml:space="preserve">Như ở cổng nhà thiếu nhi Sương Lĩnh. Như ở khúc cua thứ mười chín năm cô mười bảy tuổi.</w:t>
       </w:r>
     </w:p>
     <w:p>
@@ -29199,7 +29239,7 @@
         <w:jc w:val="both"/>
       </w:pPr>
       <w:r>
-        <w:t xml:space="preserve">Như mười bốn năm trước. Như mỗi tối thứ Ba, thứ Năm, thứ Bảy ở Hải Âu. Cô từ trên tầng ba đi xuống. Anh đứng dưới cây phượng thứ ba. Tay đặt lên thân cây. Một chỗ.</w:t>
+        <w:t xml:space="preserve">Như mười bốn năm trước. Mỗi tối, anh đứng dưới cây phượng thứ ba nhìn cô đi lên dốc. Tay đặt lên thân cây. Một chỗ. Bốn năm cô không quay lại nhìn. Năm mười sáu tuổi cô mới biết.</w:t>
       </w:r>
     </w:p>
     <w:p>
@@ -29825,7 +29865,7 @@
         <w:jc w:val="both"/>
       </w:pPr>
       <w:r>
-        <w:t xml:space="preserve">Anh không biết vì sao. Chỉ biết hôm nay không phải chờ như những lần kia. Những lần kia anh chờ một người từ trên tầng ba đi xuống rồi đi bên cạnh anh về đến đầu dốc Chợ Cũ. Rồi rẽ.</w:t>
+        <w:t xml:space="preserve">Anh không biết vì sao. Chỉ biết hôm nay không phải chờ như những lần kia. Những lần kia anh đi cạnh một người từ Hải Âu về đến đây. Rồi đứng nhìn người ấy đi lên dốc. Đến khi khuất.</w:t>
       </w:r>
     </w:p>
     <w:p>
@@ -30251,7 +30291,7 @@
           <w:i/>
           <w:iCs/>
         </w:rPr>
-        <w:t xml:space="preserve">Năm nó mười tám. Đèo Sương Lĩnh. Khúc cua mười chín. Tao dừng xe. Tao định quay về Nguyệt Loan. Bán xe. Làm gì cũng được. Không lên núi. Tao đứng ở mép vực. Nó nằm sau thùng xe. Đeo nẹp. Nó gõ ba tiếng lên vách thùng. Tao không biết ba tiếng là gì. Tao lên xe. Lái tiếp. Tám năm tao không hỏi. Tháng trước Khúc Nam bảo ba tiếng là "có tớ đây". Từ hôm nay mày nghe nó gõ.</w:t>
+        <w:t xml:space="preserve">Năm nó mười bảy. Đèo Sương Lĩnh. Khúc cua mười chín. Tao dừng xe. Tao định quay về Nguyệt Loan. Bán xe. Làm gì cũng được. Không lên núi. Tao đứng ở mép vực. Nó ngồi trong cabin. Đeo nẹp. Nó gõ ba tiếng lên kính cửa. Tao không biết ba tiếng là gì. Tao lên xe. Lái tiếp. Chín năm tao không hỏi. Tháng trước Khúc Nam bảo ba tiếng là "có tớ đây". Từ hôm nay mày nghe nó gõ.</w:t>
       </w:r>
     </w:p>
     <w:p>
@@ -30351,7 +30391,7 @@
         <w:jc w:val="both"/>
       </w:pPr>
       <w:r>
-        <w:t xml:space="preserve">"Em đau quá." Cô nói. "Em nằm sau thùng xe. Em gõ vì đau. Em không biết bố đứng ở mép vực."</w:t>
+        <w:t xml:space="preserve">"Em đau quá." Cô nói. "Em ngồi trong cabin. Em gõ vì đau. Em không biết bố đứng ở mép vực."</w:t>
       </w:r>
     </w:p>
     <w:p>
@@ -31082,7 +31122,7 @@
           <w:i/>
           <w:iCs/>
         </w:rPr>
-        <w:t xml:space="preserve">Một. Thuê theo sức người nghèo hơn. Chia đôi.</w:t>
+        <w:t xml:space="preserve">1. Thuê theo sức người nghèo hơn. Chia đôi.</w:t>
       </w:r>
     </w:p>
     <w:p>
@@ -31096,7 +31136,7 @@
           <w:i/>
           <w:iCs/>
         </w:rPr>
-        <w:t xml:space="preserve">Năm. Không làm gì một mình. Nói với nhau trước khi quyết.</w:t>
+        <w:t xml:space="preserve">5. Nói trước. Kể cả chuyện chắc chắn bị cấm.</w:t>
       </w:r>
     </w:p>
     <w:p>
@@ -31110,7 +31150,7 @@
           <w:i/>
           <w:iCs/>
         </w:rPr>
-        <w:t xml:space="preserve">Chín. Được giấu một chuyện. Đến một ngày định trước.</w:t>
+        <w:t xml:space="preserve">9. Có một chuyện Phong chưa nói. Bố cho phép giấu. Hạ được biết là có. Không được hỏi là gì. Đến Marivonne.</w:t>
       </w:r>
     </w:p>
     <w:p>
@@ -31124,7 +31164,7 @@
           <w:i/>
           <w:iCs/>
         </w:rPr>
-        <w:t xml:space="preserve">Mười hai. Người không có tờ giấy thì cũng có con số. Hỏi nhau. Mỗi tối.</w:t>
+        <w:t xml:space="preserve">12. Người không có tờ giấy thì cũng có con số. Hỏi nhau. Mỗi tối.</w:t>
       </w:r>
     </w:p>
     <w:p>
@@ -31138,7 +31178,7 @@
           <w:i/>
           <w:iCs/>
         </w:rPr>
-        <w:t xml:space="preserve">Mười bốn. Hỏi gì cũng được. Phải.</w:t>
+        <w:t xml:space="preserve">14. Hỏi gì cũng được. Phải.</w:t>
       </w:r>
     </w:p>
     <w:p>
@@ -31152,7 +31192,7 @@
           <w:i/>
           <w:iCs/>
         </w:rPr>
-        <w:t xml:space="preserve">Mười lăm. Nhà bên cạnh có người. Bên dưới có người. Gõ thì có người nghe.</w:t>
+        <w:t xml:space="preserve">15. Nhà bên cạnh có người. Bên dưới có người. Gõ thì có người nghe.</w:t>
       </w:r>
     </w:p>
     <w:p>
@@ -31216,7 +31256,7 @@
           <w:i/>
           <w:iCs/>
         </w:rPr>
-        <w:t xml:space="preserve">Mười sáu.</w:t>
+        <w:t xml:space="preserve">16.</w:t>
       </w:r>
     </w:p>
     <w:p>
@@ -36485,7 +36525,7 @@
         <w:jc w:val="both"/>
       </w:pPr>
       <w:r>
-        <w:t xml:space="preserve">Bước lên sàn gỗ. Chân vẫn mang giày. Giày Standard gót năm phân. Hai mươi ba năm giải nghệ. Lăng mang theo đôi giày ấy từ Ngân Sơn.</w:t>
+        <w:t xml:space="preserve">Bước lên sàn gỗ. Chân vẫn mang giày. Giày Standard gót năm phân. Hai mươi sáu năm giải nghệ. Lăng mang theo đôi giày ấy từ Ngân Sơn.</w:t>
       </w:r>
     </w:p>
     <w:p>
@@ -36689,7 +36729,7 @@
         <w:jc w:val="both"/>
       </w:pPr>
       <w:r>
-        <w:t xml:space="preserve">Lăng quay sang ông Lư. Cúi chào dàn nhạc. Như hai mươi ba năm.</w:t>
+        <w:t xml:space="preserve">Lăng quay sang ông Lư. Cúi chào dàn nhạc. Như hai mươi sáu năm.</w:t>
       </w:r>
     </w:p>
     <w:p>
@@ -37896,7 +37936,17 @@
           <w:i/>
           <w:iCs/>
         </w:rPr>
-        <w:t xml:space="preserve">Không làm gì một mình. Nói với nhau trước khi quyết.</w:t>
+        <w:t xml:space="preserve">Nói trước. Kể cả chuyện chắc chắn bị cấm.</w:t>
+      </w:r>
+      <w:r>
+        <w:t xml:space="preserve"> Và lời hứa đêm mất điện: </w:t>
+      </w:r>
+      <w:r>
+        <w:rPr>
+          <w:i/>
+          <w:iCs/>
+        </w:rPr>
+        <w:t xml:space="preserve">Không làm gì một mình.</w:t>
       </w:r>
     </w:p>
     <w:p>
@@ -41826,7 +41876,7 @@
         <w:jc w:val="both"/>
       </w:pPr>
       <w:r>
-        <w:t xml:space="preserve">Rồi cô kéo anh xuống. Giường gỗ ông nội anh đóng. Kêu một tiếng. Như bậc thứ mười.</w:t>
+        <w:t xml:space="preserve">Rồi cô kéo anh xuống. Chiếc giường đơn sát tường. Kêu một tiếng. Như bậc thứ mười.</w:t>
       </w:r>
     </w:p>
     <w:p>
@@ -42333,7 +42383,7 @@
           <w:i/>
           <w:iCs/>
         </w:rPr>
-        <w:t xml:space="preserve">Mười bảy.</w:t>
+        <w:t xml:space="preserve">17.</w:t>
       </w:r>
     </w:p>
     <w:p>
@@ -42981,17 +43031,17 @@
         <w:jc w:val="both"/>
       </w:pPr>
       <w:r>
-        <w:t xml:space="preserve">Ba năm trước, cô nhìn thành phố này qua đúng ô cửa sổ ấy. Không. Không đúng ô ấy. Nhưng cùng một cảnh. Năm ấy cô hai mươi ba tuổi. Ngồi cạnh anh. Không dám đặt tay lên tay vịn chung.</w:t>
-      </w:r>
-    </w:p>
-    <w:p>
-      <w:pPr>
-        <w:spacing w:after="120" w:line="340"/>
-        <w:ind w:firstLine="425"/>
-        <w:jc w:val="both"/>
-      </w:pPr>
-      <w:r>
-        <w:t xml:space="preserve">Bây giờ tay trái cô đặt trên tay vịn. Tay trái anh đặt lên tay cô. Hai sợi ruy băng chạm nhau. Đỏ. Xanh.</w:t>
+        <w:t xml:space="preserve">Ba năm trước, cô nhìn thành phố này qua đúng ô cửa sổ ấy. Không. Không đúng ô ấy. Nhưng cùng một cảnh. Năm ấy cô hai mươi ba tuổi. Ngồi cạnh anh. Tay anh trên tay vịn giữa hai ghế khẽ dịch sang. Chạm vào tay cô. Rồi nằm yên đó đến khi máy bay dừng hẳn. Không ai nói gì.</w:t>
+      </w:r>
+    </w:p>
+    <w:p>
+      <w:pPr>
+        <w:spacing w:after="120" w:line="340"/>
+        <w:ind w:firstLine="425"/>
+        <w:jc w:val="both"/>
+      </w:pPr>
+      <w:r>
+        <w:t xml:space="preserve">Bây giờ tay trái cô đặt trên tay vịn trước. Tay trái anh đặt lên tay cô. Hai sợi ruy băng chạm nhau. Đỏ. Xanh.</w:t>
       </w:r>
     </w:p>
     <w:p>
@@ -43151,7 +43201,7 @@
         <w:jc w:val="both"/>
       </w:pPr>
       <w:r>
-        <w:t xml:space="preserve">Ba năm trước, cô ở phòng này. Bão tuyết. Không còn bờ sông. Không còn đường. Chỉ còn một tấm chăn trắng. Đêm ấy hai người ngồi ở hành lang tầng ba, trùm chung một chiếc chăn, nghe bão gào ngoài cửa sổ. Cách nhau một gang tay. Không chạm.</w:t>
+        <w:t xml:space="preserve">Ba năm trước, cô ở phòng này. Bão tuyết. Không còn bờ sông. Không còn đường. Chỉ còn một tấm chăn trắng. Đêm ấy hai người ngồi ở hành lang tầng ba, trùm chung một chiếc chăn, nghe bão gào ngoài cửa sổ. Cô tựa đầu vào vai anh. Anh kéo cô vào lòng. Đến sáng.</w:t>
       </w:r>
     </w:p>
     <w:p>
@@ -43211,7 +43261,7 @@
         <w:jc w:val="both"/>
       </w:pPr>
       <w:r>
-        <w:t xml:space="preserve">"Đêm thứ hai em ngủ ở hành lang." Anh nói. "Gối đầu lên vai anh. Ba tiếng. Anh không dám cử động."</w:t>
+        <w:t xml:space="preserve">"Đêm bão em ngủ ở hành lang." Anh nói. "Trên ngực anh. Anh không dám cử động. Bốn giờ sáng anh bế em vào phòng."</w:t>
       </w:r>
     </w:p>
     <w:p>
@@ -43995,7 +44045,7 @@
         <w:jc w:val="both"/>
       </w:pPr>
       <w:r>
-        <w:t xml:space="preserve">Ba năm trước, cô đứng ở cổng này. Không dám vào. Năm mười bảy tuổi, cái cổng này là nơi cô đẩy anh đến.</w:t>
+        <w:t xml:space="preserve">Ba năm trước, thầy Lucien đứng đợi ở cổng này. Tuyết phủ trắng vai áo dạ. Cô đi vào sau lưng anh. Qua hành lang treo ảnh một trăm năm. Năm mười bảy tuổi, cái cổng này là nơi cô đẩy anh đến.</w:t>
       </w:r>
     </w:p>
     <w:p>
@@ -45909,7 +45959,7 @@
         <w:jc w:val="both"/>
       </w:pPr>
       <w:r>
-        <w:t xml:space="preserve">Ba năm trước, cũng ở nhà thi đấu này, cũng chung kết Cúp Kim Diệp, cô đứng ở cánh gà. Tay cô lạnh. Anh không hỏi vì sao. Năm ấy anh chưa biết hỏi.</w:t>
+        <w:t xml:space="preserve">Bốn năm trước, cũng ở nhà thi đấu này, cũng chung kết Cúp Kim Diệp, cô đứng ở cánh gà. Tay cô lạnh. Anh không hỏi vì sao. Năm ấy anh chưa biết hỏi.</w:t>
       </w:r>
     </w:p>
     <w:p>
@@ -46806,7 +46856,7 @@
           <w:i/>
           <w:iCs/>
         </w:rPr>
-        <w:t xml:space="preserve">Không làm gì một mình. Nói với nhau trước khi quyết.</w:t>
+        <w:t xml:space="preserve">Nói trước. Kể cả chuyện chắc chắn bị cấm.</w:t>
       </w:r>
     </w:p>
     <w:p>
@@ -47413,7 +47463,7 @@
         <w:jc w:val="both"/>
       </w:pPr>
       <w:r>
-        <w:t xml:space="preserve">Danh sách triệu tập đội tuyển Latin quốc gia mùa giải mới công bố lúc bốn giờ chiều. Dán trên bảng tin cạnh phòng bảo vệ. Như năm năm trước.</w:t>
+        <w:t xml:space="preserve">Danh sách triệu tập đội tuyển Latin quốc gia mùa giải mới công bố lúc bốn giờ chiều. Trên trang thông báo của Liên đoàn. Năm nay Trung tâm in thêm một bản. Dán trên bảng tin cạnh phòng bảo vệ.</w:t>
       </w:r>
     </w:p>
     <w:p>
@@ -47560,7 +47610,7 @@
         <w:jc w:val="both"/>
       </w:pPr>
       <w:r>
-        <w:t xml:space="preserve">Năm năm trước. Mùa xuân. Hai mươi hai tuổi. Anh vừa từ Aldmere về. Cô vừa từ Sương Lĩnh xuống. Danh sách dán trên bảng tin này. Hai cái tên trên cùng một tờ giấy. Không cùng một dòng.</w:t>
+        <w:t xml:space="preserve">Năm năm trước. Mùa xuân. Hai mươi hai tuổi. Anh vừa từ Aldmere về. Cô vừa từ Sương Lĩnh xuống. Danh sách đăng trên trang của Liên đoàn. Nền trắng chữ đen. Hai cái tên ở hai danh sách. Latin nam. Latin nữ. Không cùng một dòng.</w:t>
       </w:r>
     </w:p>
     <w:p>
@@ -54475,17 +54525,17 @@
           <w:i/>
           <w:iCs/>
         </w:rPr>
-        <w:t xml:space="preserve">Một. Thuê theo sức người nghèo hơn. Chia đôi.</w:t>
-      </w:r>
-    </w:p>
-    <w:p>
-      <w:pPr>
-        <w:spacing w:after="120" w:line="340"/>
-        <w:ind w:firstLine="425"/>
-        <w:jc w:val="both"/>
-      </w:pPr>
-      <w:r>
-        <w:t xml:space="preserve">Tháng Một năm hai mươi lăm tuổi. Bàn bếp. Anh muốn thuê căn hộ có thang máy. Cô bảo không. Cô bảo năm mươi sáu bậc thì có sao. Anh bảo lưng em. Cô bảo lưng em leo được năm mươi sáu bậc thì lưng em mới biết lưng em còn tốt. Rồi cô viết luật số một.</w:t>
+        <w:t xml:space="preserve">1. Thuê theo sức người nghèo hơn. Chia đôi.</w:t>
+      </w:r>
+    </w:p>
+    <w:p>
+      <w:pPr>
+        <w:spacing w:after="120" w:line="340"/>
+        <w:ind w:firstLine="425"/>
+        <w:jc w:val="both"/>
+      </w:pPr>
+      <w:r>
+        <w:t xml:space="preserve">Mùa đông năm hai mươi bốn tuổi. Lúc tìm nhà. Anh muốn thuê căn hộ có thang máy. Cô bảo không. Cô bảo năm mươi sáu bậc thì có sao. Anh bảo lưng em. Cô bảo lưng em leo được năm mươi sáu bậc thì lưng em mới biết lưng em còn tốt. Rồi cô viết luật số một.</w:t>
       </w:r>
     </w:p>
     <w:p>
@@ -54499,7 +54549,7 @@
           <w:i/>
           <w:iCs/>
         </w:rPr>
-        <w:t xml:space="preserve">Năm. Không làm gì một mình. Nói với nhau trước khi quyết.</w:t>
+        <w:t xml:space="preserve">5. Nói trước. Kể cả chuyện chắc chắn bị cấm.</w:t>
       </w:r>
     </w:p>
     <w:p>
@@ -54513,7 +54563,7 @@
           <w:i/>
           <w:iCs/>
         </w:rPr>
-        <w:t xml:space="preserve">Mười một. Ai lên được năm mươi sáu bậc thì ăn cơm.</w:t>
+        <w:t xml:space="preserve">11. Ai lên được năm mươi sáu bậc thì ăn cơm.</w:t>
       </w:r>
     </w:p>
     <w:p>
@@ -54527,7 +54577,7 @@
           <w:i/>
           <w:iCs/>
         </w:rPr>
-        <w:t xml:space="preserve">Mười lăm. Nhà bên cạnh có người. Bên dưới có người. Gõ thì có người nghe.</w:t>
+        <w:t xml:space="preserve">15. Nhà bên cạnh có người. Bên dưới có người. Gõ thì có người nghe.</w:t>
       </w:r>
     </w:p>
     <w:p>
@@ -57489,7 +57539,7 @@
           <w:i/>
           <w:iCs/>
         </w:rPr>
-        <w:t xml:space="preserve">Mười tám. Ngày nào cũng gặp thì vẫn nói "chào".</w:t>
+        <w:t xml:space="preserve">18. Ngày nào cũng gặp thì vẫn nói "chào".</w:t>
       </w:r>
     </w:p>
     <w:p>
@@ -57513,7 +57563,7 @@
           <w:i/>
           <w:iCs/>
         </w:rPr>
-        <w:t xml:space="preserve">Mười chín. Đèn ai về sau thì bật. Cửa ai đến trước thì mở.</w:t>
+        <w:t xml:space="preserve">19. Đèn ai về sau thì bật. Cửa ai đến trước thì mở.</w:t>
       </w:r>
     </w:p>
     <w:p>

</xml_diff>